<commit_message>
Align course authorities and portal mappings
</commit_message>
<xml_diff>
--- a/STARLAB_Unit_2/Student Handouts/Unit 2 Student Handout 09 - Safety and Risk Assessment.docx
+++ b/STARLAB_Unit_2/Student Handouts/Unit 2 Student Handout 09 - Safety and Risk Assessment.docx
@@ -1316,6 +1316,14 @@
     </w:p>
     <w:p>
       <w:pPr>
+        <w:pStyle w:val="Heading2"/>
+      </w:pPr>
+      <w:r>
+        <w:t>Use the exact Project Approval Tracker status. District safety or equipment forms are supplied locally and must be completed when applicable.</w:t>
+      </w:r>
+    </w:p>
+    <w:p>
+      <w:pPr>
         <w:spacing w:after="240" w:before="240" w:lineRule="auto"/>
         <w:rPr/>
       </w:pPr>
@@ -1339,7 +1347,7 @@
         <w:rPr>
           <w:rtl w:val="0"/>
         </w:rPr>
-        <w:t xml:space="preserve">Approved to proceed</w:t>
+        <w:t>Approved for Pilot Testing</w:t>
       </w:r>
     </w:p>
     <w:p>
@@ -1355,7 +1363,7 @@
         <w:rPr>
           <w:rtl w:val="0"/>
         </w:rPr>
-        <w:t xml:space="preserve">Approved with modifications</w:t>
+        <w:t>Approved With Modifications</w:t>
       </w:r>
     </w:p>
     <w:p>
@@ -1371,7 +1379,7 @@
         <w:rPr>
           <w:rtl w:val="0"/>
         </w:rPr>
-        <w:t xml:space="preserve">Needs additional safety plan</w:t>
+        <w:t>Needs Safety Review</w:t>
       </w:r>
     </w:p>
     <w:p>
@@ -1387,7 +1395,7 @@
         <w:rPr>
           <w:rtl w:val="0"/>
         </w:rPr>
-        <w:t xml:space="preserve">Needs mentor or administrator review</w:t>
+        <w:t>Needs Mentor Review</w:t>
       </w:r>
     </w:p>
     <w:p>
@@ -1403,7 +1411,7 @@
         <w:rPr>
           <w:rtl w:val="0"/>
         </w:rPr>
-        <w:t xml:space="preserve">Not approved in current form</w:t>
+        <w:t>Not Approved in Current Form</w:t>
       </w:r>
     </w:p>
     <w:p>

</xml_diff>